<commit_message>
Kim12_tema-3-unite-sonu-sorulari: gorsel alanlarina Shutter onizlemeleri yerlestirildi (2.3 bicimi)
</commit_message>
<xml_diff>
--- a/sorular/Kim12_tema-3-unite-sonu-sorulari.docx
+++ b/sorular/Kim12_tema-3-unite-sonu-sorulari.docx
@@ -1898,85 +1898,59 @@
         <w:t xml:space="preserve">Zeynep’in ailesi Mersin’de mandalina yetiştirmekte ve ürünlerini yakındaki bir meyve suyu fabrikasına satmaktadır. Fabrikada her gün tonlarca kabuk ve posa atığı oluşmaktadır. Zeynep, bu atıklardan elde edilen pektinle annesinin sebze bahçesinde kullanabileceği bir tohum bandı yapmak ister. Tohum bandı, tohumların belirli aralıklarla yapıştırıldığı ince bir şerittir; rulo hâlinde saklanır, toprağa serilip üzeri örtüldükten sonra sulandığında dağılarak tohumların çimlenmesine engel olmamalıdır. Zeynep okul laboratuvarında aynı miktarda pektin ve su kullanarak farklı bileşimlerde filmler hazırlar, filmleri aynı kalınlıkta döküp aynı koşullarda kurutur.</w:t>
       </w:r>
     </w:p>
-    <w:tbl>
-      <w:tblPr>
-        <w:tblW w:w="9000" w:type="dxa"/>
+    <w:p>
+      <w:pPr>
         <w:jc w:val="center"/>
-        <w:tblBorders>
-          <w:top w:val="single" w:sz="8" w:space="0" w:color="7F7F7F"/>
-          <w:left w:val="single" w:sz="8" w:space="0" w:color="7F7F7F"/>
-          <w:bottom w:val="single" w:sz="8" w:space="0" w:color="7F7F7F"/>
-          <w:right w:val="single" w:sz="8" w:space="0" w:color="7F7F7F"/>
-        </w:tblBorders>
-      </w:tblPr>
-      <w:tblGrid>
-        <w:gridCol w:w="9000"/>
-      </w:tblGrid>
-      <w:tr>
-        <w:tc>
-          <w:tcPr>
-            <w:tcW w:w="9000" w:type="dxa"/>
-            <w:shd w:val="clear" w:color="auto" w:fill="EDEDED"/>
-          </w:tcPr>
-          <w:p>
-            <w:pPr>
-              <w:jc w:val="both"/>
-              <w:rPr>
-                <w:rFonts w:ascii="Times New Roman" w:hAnsi="Times New Roman" w:cs="Times New Roman"/>
-                <w:lang w:val="tr-TR"/>
-              </w:rPr>
-            </w:pPr>
-            <w:r>
-              <w:rPr>
-                <w:rFonts w:ascii="Times New Roman" w:hAnsi="Times New Roman" w:cs="Times New Roman"/>
-                <w:lang w:val="tr-TR"/>
-              </w:rPr>
-              <w:t xml:space="preserve">GÖRSEL ALANI (Shutterstock)</w:t>
-            </w:r>
-          </w:p>
-          <w:p>
-            <w:pPr>
-              <w:jc w:val="both"/>
-              <w:rPr>
-                <w:rFonts w:ascii="Times New Roman" w:hAnsi="Times New Roman" w:cs="Times New Roman"/>
-                <w:lang w:val="tr-TR"/>
-              </w:rPr>
-            </w:pPr>
-            <w:r>
-              <w:rPr>
-                <w:rFonts w:ascii="Times New Roman" w:hAnsi="Times New Roman" w:cs="Times New Roman"/>
-                <w:lang w:val="tr-TR"/>
-              </w:rPr>
-              <w:t xml:space="preserve">Tarif: Dallarında olgun mandalinalar bulunan bir mandalina bahçesi; yere bırakılmış kasalarda toplanmış meyveler (marka/logo görünmesin).</w:t>
-            </w:r>
-          </w:p>
-          <w:p>
-            <w:pPr>
-              <w:jc w:val="both"/>
-              <w:rPr>
-                <w:rFonts w:ascii="Times New Roman" w:hAnsi="Times New Roman" w:cs="Times New Roman"/>
-                <w:lang w:val="tr-TR"/>
-              </w:rPr>
-            </w:pPr>
-            <w:r>
-              <w:rPr>
-                <w:rFonts w:ascii="Times New Roman" w:hAnsi="Times New Roman" w:cs="Times New Roman"/>
-                <w:lang w:val="tr-TR"/>
-              </w:rPr>
-              <w:t xml:space="preserve">Shutter ID: 2424676439 (fotoğraf) — Crate with collected ripe citrus fruits</w:t>
-            </w:r>
-          </w:p>
-        </w:tc>
-      </w:tr>
-    </w:tbl>
-    <w:p>
-      <w:pPr>
-        <w:jc w:val="both"/>
-        <w:rPr>
-          <w:rFonts w:ascii="Times New Roman" w:hAnsi="Times New Roman" w:cs="Times New Roman"/>
-          <w:lang w:val="tr-TR"/>
-        </w:rPr>
-      </w:pPr>
+      </w:pPr>
+      <w:r>
+        <w:drawing>
+          <wp:inline xmlns:a="http://schemas.openxmlformats.org/drawingml/2006/main" xmlns:pic="http://schemas.openxmlformats.org/drawingml/2006/picture">
+            <wp:extent cx="3436363" cy="2520000"/>
+            <wp:docPr id="900004" name="Picture 900004"/>
+            <wp:cNvGraphicFramePr>
+              <a:graphicFrameLocks noChangeAspect="1"/>
+            </wp:cNvGraphicFramePr>
+            <a:graphic>
+              <a:graphicData uri="http://schemas.openxmlformats.org/drawingml/2006/picture">
+                <pic:pic>
+                  <pic:nvPicPr>
+                    <pic:cNvPr id="0" name="2424676439_d.jpg"/>
+                    <pic:cNvPicPr/>
+                  </pic:nvPicPr>
+                  <pic:blipFill>
+                    <a:blip r:embed="rId11"/>
+                    <a:stretch>
+                      <a:fillRect/>
+                    </a:stretch>
+                  </pic:blipFill>
+                  <pic:spPr>
+                    <a:xfrm>
+                      <a:off x="0" y="0"/>
+                      <a:ext cx="3436363" cy="2520000"/>
+                    </a:xfrm>
+                    <a:prstGeom prst="rect"/>
+                  </pic:spPr>
+                </pic:pic>
+              </a:graphicData>
+            </a:graphic>
+          </wp:inline>
+        </w:drawing>
+      </w:r>
+    </w:p>
+    <w:p>
+      <w:pPr>
+        <w:jc w:val="center"/>
+      </w:pPr>
+      <w:r>
+        <w:rPr>
+          <w:rFonts w:ascii="Times New Roman" w:hAnsi="Times New Roman" w:cs="Times New Roman"/>
+          <w:b/>
+          <w:bCs/>
+          <w:highlight w:val="yellow"/>
+          <w:lang w:val="tr-TR"/>
+        </w:rPr>
+        <w:t xml:space="preserve">Shutter id: 2424676439</w:t>
+      </w:r>
     </w:p>
     <w:p>
       <w:pPr>
@@ -4709,85 +4683,59 @@
         <w:t xml:space="preserve">Konya Ovası’nda şeker pancarı yetiştiren bir tarım kooperatifi, yer altı suyu seviyesinin her yıl düşmesi üzerine sulama yöntemini değiştirmeye karar vermiştir. Kooperatif önce salma sulamadan damla sulamaya geçmiş, ertesi yıl da toprak nemi sensörlerinden, hava durumu tahminlerinden ve uydu görüntülerinden yararlanan yapay zekâ destekli bir sulama planlama sistemi kurmuştur. Sistem hangi tarlaya, ne zaman ve ne kadar su verileceğini belirlemektedir. Üç yöntemle elde edilen sonuçlar grafikte verilmiştir.</w:t>
       </w:r>
     </w:p>
-    <w:tbl>
-      <w:tblPr>
-        <w:tblW w:w="9000" w:type="dxa"/>
+    <w:p>
+      <w:pPr>
         <w:jc w:val="center"/>
-        <w:tblBorders>
-          <w:top w:val="single" w:sz="8" w:space="0" w:color="7F7F7F"/>
-          <w:left w:val="single" w:sz="8" w:space="0" w:color="7F7F7F"/>
-          <w:bottom w:val="single" w:sz="8" w:space="0" w:color="7F7F7F"/>
-          <w:right w:val="single" w:sz="8" w:space="0" w:color="7F7F7F"/>
-        </w:tblBorders>
-      </w:tblPr>
-      <w:tblGrid>
-        <w:gridCol w:w="9000"/>
-      </w:tblGrid>
-      <w:tr>
-        <w:tc>
-          <w:tcPr>
-            <w:tcW w:w="9000" w:type="dxa"/>
-            <w:shd w:val="clear" w:color="auto" w:fill="EDEDED"/>
-          </w:tcPr>
-          <w:p>
-            <w:pPr>
-              <w:jc w:val="both"/>
-              <w:rPr>
-                <w:rFonts w:ascii="Times New Roman" w:hAnsi="Times New Roman" w:cs="Times New Roman"/>
-                <w:lang w:val="tr-TR"/>
-              </w:rPr>
-            </w:pPr>
-            <w:r>
-              <w:rPr>
-                <w:rFonts w:ascii="Times New Roman" w:hAnsi="Times New Roman" w:cs="Times New Roman"/>
-                <w:lang w:val="tr-TR"/>
-              </w:rPr>
-              <w:t xml:space="preserve">GÖRSEL ALANI (Shutterstock)</w:t>
-            </w:r>
-          </w:p>
-          <w:p>
-            <w:pPr>
-              <w:jc w:val="both"/>
-              <w:rPr>
-                <w:rFonts w:ascii="Times New Roman" w:hAnsi="Times New Roman" w:cs="Times New Roman"/>
-                <w:lang w:val="tr-TR"/>
-              </w:rPr>
-            </w:pPr>
-            <w:r>
-              <w:rPr>
-                <w:rFonts w:ascii="Times New Roman" w:hAnsi="Times New Roman" w:cs="Times New Roman"/>
-                <w:lang w:val="tr-TR"/>
-              </w:rPr>
-              <w:t xml:space="preserve">Tarif: Şeker pancarı ya da sebze tarlasında sıralar boyunca uzanan siyah damla sulama boruları; toprağa yerleştirilmiş küçük bir nem sensörü.</w:t>
-            </w:r>
-          </w:p>
-          <w:p>
-            <w:pPr>
-              <w:jc w:val="both"/>
-              <w:rPr>
-                <w:rFonts w:ascii="Times New Roman" w:hAnsi="Times New Roman" w:cs="Times New Roman"/>
-                <w:lang w:val="tr-TR"/>
-              </w:rPr>
-            </w:pPr>
-            <w:r>
-              <w:rPr>
-                <w:rFonts w:ascii="Times New Roman" w:hAnsi="Times New Roman" w:cs="Times New Roman"/>
-                <w:lang w:val="tr-TR"/>
-              </w:rPr>
-              <w:t xml:space="preserve">Shutter ID: 2604460975 (fotoğraf) — Precision drip irrigation in a field</w:t>
-            </w:r>
-          </w:p>
-        </w:tc>
-      </w:tr>
-    </w:tbl>
-    <w:p>
-      <w:pPr>
-        <w:jc w:val="both"/>
-        <w:rPr>
-          <w:rFonts w:ascii="Times New Roman" w:hAnsi="Times New Roman" w:cs="Times New Roman"/>
-          <w:lang w:val="tr-TR"/>
-        </w:rPr>
-      </w:pPr>
+      </w:pPr>
+      <w:r>
+        <w:drawing>
+          <wp:inline xmlns:a="http://schemas.openxmlformats.org/drawingml/2006/main" xmlns:pic="http://schemas.openxmlformats.org/drawingml/2006/picture">
+            <wp:extent cx="3439490" cy="2520000"/>
+            <wp:docPr id="900005" name="Picture 900005"/>
+            <wp:cNvGraphicFramePr>
+              <a:graphicFrameLocks noChangeAspect="1"/>
+            </wp:cNvGraphicFramePr>
+            <a:graphic>
+              <a:graphicData uri="http://schemas.openxmlformats.org/drawingml/2006/picture">
+                <pic:pic>
+                  <pic:nvPicPr>
+                    <pic:cNvPr id="0" name="2604460975_d.jpg"/>
+                    <pic:cNvPicPr/>
+                  </pic:nvPicPr>
+                  <pic:blipFill>
+                    <a:blip r:embed="rId12"/>
+                    <a:stretch>
+                      <a:fillRect/>
+                    </a:stretch>
+                  </pic:blipFill>
+                  <pic:spPr>
+                    <a:xfrm>
+                      <a:off x="0" y="0"/>
+                      <a:ext cx="3439490" cy="2520000"/>
+                    </a:xfrm>
+                    <a:prstGeom prst="rect"/>
+                  </pic:spPr>
+                </pic:pic>
+              </a:graphicData>
+            </a:graphic>
+          </wp:inline>
+        </w:drawing>
+      </w:r>
+    </w:p>
+    <w:p>
+      <w:pPr>
+        <w:jc w:val="center"/>
+      </w:pPr>
+      <w:r>
+        <w:rPr>
+          <w:rFonts w:ascii="Times New Roman" w:hAnsi="Times New Roman" w:cs="Times New Roman"/>
+          <w:b/>
+          <w:bCs/>
+          <w:highlight w:val="yellow"/>
+          <w:lang w:val="tr-TR"/>
+        </w:rPr>
+        <w:t xml:space="preserve">Shutter id: 2604460975</w:t>
+      </w:r>
     </w:p>
     <w:p>
       <w:pPr>
@@ -6790,85 +6738,59 @@
         <w:t xml:space="preserve">Antalya’da bir belediye, “sürdürülebilir durak” projesi hazırlamaktadır. Projeye göre durakların çatısı renkli ve yarı saydam boyaya duyarlı güneş panellerinden yapılacak, bu panellerin ürettiği elektrikle duraktaki bilgi ekranı ve aydınlatma çalıştırılacaktır. Duraklardaki çöp kutularına “kompostlanabilir” etiketli poşetler takılacaktır. Ayrıca yapay zekâ destekli bir program, yolcu kartı verilerinden ve trafik bilgisinden yararlanarak hangi hatta ne sıklıkla otobüs gönderileceğini önerecektir.</w:t>
       </w:r>
     </w:p>
-    <w:tbl>
-      <w:tblPr>
-        <w:tblW w:w="9000" w:type="dxa"/>
+    <w:p>
+      <w:pPr>
         <w:jc w:val="center"/>
-        <w:tblBorders>
-          <w:top w:val="single" w:sz="8" w:space="0" w:color="7F7F7F"/>
-          <w:left w:val="single" w:sz="8" w:space="0" w:color="7F7F7F"/>
-          <w:bottom w:val="single" w:sz="8" w:space="0" w:color="7F7F7F"/>
-          <w:right w:val="single" w:sz="8" w:space="0" w:color="7F7F7F"/>
-        </w:tblBorders>
-      </w:tblPr>
-      <w:tblGrid>
-        <w:gridCol w:w="9000"/>
-      </w:tblGrid>
-      <w:tr>
-        <w:tc>
-          <w:tcPr>
-            <w:tcW w:w="9000" w:type="dxa"/>
-            <w:shd w:val="clear" w:color="auto" w:fill="EDEDED"/>
-          </w:tcPr>
-          <w:p>
-            <w:pPr>
-              <w:jc w:val="both"/>
-              <w:rPr>
-                <w:rFonts w:ascii="Times New Roman" w:hAnsi="Times New Roman" w:cs="Times New Roman"/>
-                <w:lang w:val="tr-TR"/>
-              </w:rPr>
-            </w:pPr>
-            <w:r>
-              <w:rPr>
-                <w:rFonts w:ascii="Times New Roman" w:hAnsi="Times New Roman" w:cs="Times New Roman"/>
-                <w:lang w:val="tr-TR"/>
-              </w:rPr>
-              <w:t xml:space="preserve">GÖRSEL ALANI (Shutterstock)</w:t>
-            </w:r>
-          </w:p>
-          <w:p>
-            <w:pPr>
-              <w:jc w:val="both"/>
-              <w:rPr>
-                <w:rFonts w:ascii="Times New Roman" w:hAnsi="Times New Roman" w:cs="Times New Roman"/>
-                <w:lang w:val="tr-TR"/>
-              </w:rPr>
-            </w:pPr>
-            <w:r>
-              <w:rPr>
-                <w:rFonts w:ascii="Times New Roman" w:hAnsi="Times New Roman" w:cs="Times New Roman"/>
-                <w:lang w:val="tr-TR"/>
-              </w:rPr>
-              <w:t xml:space="preserve">Tarif: Çatısı yarı saydam, renkli güneş panellerinden oluşan modern bir otobüs durağı; durakta dijital bilgi ekranı (marka/logo görünmesin).</w:t>
-            </w:r>
-          </w:p>
-          <w:p>
-            <w:pPr>
-              <w:jc w:val="both"/>
-              <w:rPr>
-                <w:rFonts w:ascii="Times New Roman" w:hAnsi="Times New Roman" w:cs="Times New Roman"/>
-                <w:lang w:val="tr-TR"/>
-              </w:rPr>
-            </w:pPr>
-            <w:r>
-              <w:rPr>
-                <w:rFonts w:ascii="Times New Roman" w:hAnsi="Times New Roman" w:cs="Times New Roman"/>
-                <w:lang w:val="tr-TR"/>
-              </w:rPr>
-              <w:t xml:space="preserve">Shutter ID: 2688359151 (fotoğraf) — Solar-powered bus stop in urban cityscape</w:t>
-            </w:r>
-          </w:p>
-        </w:tc>
-      </w:tr>
-    </w:tbl>
-    <w:p>
-      <w:pPr>
-        <w:jc w:val="both"/>
-        <w:rPr>
-          <w:rFonts w:ascii="Times New Roman" w:hAnsi="Times New Roman" w:cs="Times New Roman"/>
-          <w:lang w:val="tr-TR"/>
-        </w:rPr>
-      </w:pPr>
+      </w:pPr>
+      <w:r>
+        <w:drawing>
+          <wp:inline xmlns:a="http://schemas.openxmlformats.org/drawingml/2006/main" xmlns:pic="http://schemas.openxmlformats.org/drawingml/2006/picture">
+            <wp:extent cx="1570275" cy="2520000"/>
+            <wp:docPr id="900006" name="Picture 900006"/>
+            <wp:cNvGraphicFramePr>
+              <a:graphicFrameLocks noChangeAspect="1"/>
+            </wp:cNvGraphicFramePr>
+            <a:graphic>
+              <a:graphicData uri="http://schemas.openxmlformats.org/drawingml/2006/picture">
+                <pic:pic>
+                  <pic:nvPicPr>
+                    <pic:cNvPr id="0" name="2688359151_d.jpg"/>
+                    <pic:cNvPicPr/>
+                  </pic:nvPicPr>
+                  <pic:blipFill>
+                    <a:blip r:embed="rId13"/>
+                    <a:stretch>
+                      <a:fillRect/>
+                    </a:stretch>
+                  </pic:blipFill>
+                  <pic:spPr>
+                    <a:xfrm>
+                      <a:off x="0" y="0"/>
+                      <a:ext cx="1570275" cy="2520000"/>
+                    </a:xfrm>
+                    <a:prstGeom prst="rect"/>
+                  </pic:spPr>
+                </pic:pic>
+              </a:graphicData>
+            </a:graphic>
+          </wp:inline>
+        </w:drawing>
+      </w:r>
+    </w:p>
+    <w:p>
+      <w:pPr>
+        <w:jc w:val="center"/>
+      </w:pPr>
+      <w:r>
+        <w:rPr>
+          <w:rFonts w:ascii="Times New Roman" w:hAnsi="Times New Roman" w:cs="Times New Roman"/>
+          <w:b/>
+          <w:bCs/>
+          <w:highlight w:val="yellow"/>
+          <w:lang w:val="tr-TR"/>
+        </w:rPr>
+        <w:t xml:space="preserve">Shutter id: 2688359151</w:t>
+      </w:r>
     </w:p>
     <w:p>
       <w:pPr>

</xml_diff>